<commit_message>
fix: §4.3.d and §4.3.e misplaced at document start; annotated subtitles updated
constitution-v155.docx:
  §4.3.d Original Jurisdiction and §4.3.e Inspectorate Findings were
  accidentally inserted at paragraph positions 0 and 1 of the DOCX —
  before the title page and preamble. This caused mobile browsers
  rendering the document to show these provisions first, then restart
  with the constitution title and preamble.

  Both paragraphs moved to their correct position: immediately after
  §4.3.c Ripeness and Mootness within Article IV. Document now opens
  correctly with title page → preamble → Article I.

annotated.html:
  Article I subtitle updated: §1.1 through §1.27 → §1.1 through §1.29
  Article III subtitle updated: §3.1 through §3.6 → §3.1 through §3.7
  Provision count confirmed at 454
</commit_message>
<xml_diff>
--- a/constitution-v155.docx
+++ b/constitution-v155.docx
@@ -2,58 +2,6 @@
 <file path=word/document.xml><?xml version="1.0" encoding="utf-8"?>
 <w:document xmlns:wpc="http://schemas.microsoft.com/office/word/2010/wordprocessingCanvas" xmlns:mc="http://schemas.openxmlformats.org/markup-compatibility/2006" xmlns:o="urn:schemas-microsoft-com:office:office" xmlns:r="http://schemas.openxmlformats.org/officeDocument/2006/relationships" xmlns:m="http://schemas.openxmlformats.org/officeDocument/2006/math" xmlns:v="urn:schemas-microsoft-com:vml" xmlns:wp14="http://schemas.microsoft.com/office/word/2010/wordprocessingDrawing" xmlns:wp="http://schemas.openxmlformats.org/drawingml/2006/wordprocessingDrawing" xmlns:w10="urn:schemas-microsoft-com:office:word" xmlns:w="http://schemas.openxmlformats.org/wordprocessingml/2006/main" xmlns:w14="http://schemas.microsoft.com/office/word/2010/wordml" xmlns:w15="http://schemas.microsoft.com/office/word/2012/wordml" xmlns:wpg="http://schemas.microsoft.com/office/word/2010/wordprocessingGroup" xmlns:wpi="http://schemas.microsoft.com/office/word/2010/wordprocessingInk" xmlns:wne="http://schemas.microsoft.com/office/word/2006/wordml" xmlns:wps="http://schemas.microsoft.com/office/word/2010/wordprocessingShape" xmlns:cx="http://schemas.microsoft.com/office/drawing/2014/chartex" xmlns:cx1="http://schemas.microsoft.com/office/drawing/2015/9/8/chartex" xmlns:cx2="http://schemas.microsoft.com/office/drawing/2015/10/21/chartex" xmlns:cx3="http://schemas.microsoft.com/office/drawing/2016/5/9/chartex" xmlns:cx4="http://schemas.microsoft.com/office/drawing/2016/5/10/chartex" xmlns:cx5="http://schemas.microsoft.com/office/drawing/2016/5/11/chartex" xmlns:cx6="http://schemas.microsoft.com/office/drawing/2016/5/12/chartex" xmlns:cx7="http://schemas.microsoft.com/office/drawing/2016/5/13/chartex" xmlns:cx8="http://schemas.microsoft.com/office/drawing/2016/5/14/chartex" xmlns:aink="http://schemas.microsoft.com/office/drawing/2016/ink" xmlns:am3d="http://schemas.microsoft.com/office/drawing/2017/model3d" xmlns:w16cex="http://schemas.microsoft.com/office/word/2018/wordml/cex" xmlns:w16cid="http://schemas.microsoft.com/office/word/2016/wordml/cid" xmlns:w16="http://schemas.microsoft.com/office/word/2018/wordml" xmlns:w16sdtdh="http://schemas.microsoft.com/office/word/2020/wordml/sdtdatahash" xmlns:w16se="http://schemas.microsoft.com/office/word/2015/wordml/symex" mc:Ignorable="w14 w15 wp14">
   <w:body>
-    <w:p>
-      <w:pPr>
-        <w:spacing w:after="60" w:before="60" w:line="280" w:lineRule="auto"/>
-        <w:jc w:val="both"/>
-      </w:pPr>
-      <w:r>
-        <w:rPr>
-          <w:rFonts w:ascii="Times New Roman" w:cs="Times New Roman" w:eastAsia="Times New Roman" w:hAnsi="Times New Roman"/>
-          <w:b/>
-          <w:bCs/>
-          <w:color w:val="1B2A4A"/>
-          <w:sz w:val="22"/>
-          <w:szCs w:val="22"/>
-        </w:rPr>
-        <w:t xml:space="preserve">4.3.d Original Jurisdiction: </w:t>
-      </w:r>
-      <w:r>
-        <w:rPr>
-          <w:rFonts w:ascii="Times New Roman" w:cs="Times New Roman" w:eastAsia="Times New Roman" w:hAnsi="Times New Roman"/>
-          <w:color w:val="000000"/>
-          <w:sz w:val="22"/>
-          <w:szCs w:val="22"/>
-        </w:rPr>
-        <w:t xml:space="preserve">The Supreme Court has original jurisdiction over disputes between States or between a State and the federal government where the dispute presents a constitutional question and no inferior court has jurisdiction adequate to resolve it. Original jurisdiction cases are heard without prior inferior court proceedings. The Supreme Court may establish by published rule the procedures governing original jurisdiction cases; the Legislature may not alter those procedures by statute. Original jurisdiction does not preclude the Court from declining to hear a case that does not present a genuine constitutional question — the standing, ripeness, and mootness requirements of §4.3 apply equally in original jurisdiction cases.</w:t>
-      </w:r>
-    </w:p>
-    <w:p>
-      <w:pPr>
-        <w:spacing w:after="60" w:before="60" w:line="280" w:lineRule="auto"/>
-        <w:jc w:val="both"/>
-      </w:pPr>
-      <w:r>
-        <w:rPr>
-          <w:rFonts w:ascii="Times New Roman" w:cs="Times New Roman" w:eastAsia="Times New Roman" w:hAnsi="Times New Roman"/>
-          <w:b/>
-          <w:bCs/>
-          <w:color w:val="1B2A4A"/>
-          <w:sz w:val="22"/>
-          <w:szCs w:val="22"/>
-        </w:rPr>
-        <w:t xml:space="preserve">4.3.e Inspectorate Findings in Constitutional Proceedings: </w:t>
-      </w:r>
-      <w:r>
-        <w:rPr>
-          <w:rFonts w:ascii="Times New Roman" w:cs="Times New Roman" w:eastAsia="Times New Roman" w:hAnsi="Times New Roman"/>
-          <w:color w:val="000000"/>
-          <w:sz w:val="22"/>
-          <w:szCs w:val="22"/>
-        </w:rPr>
-        <w:t xml:space="preserve">A finding published to the National Record System by the Executive Inspectorate, Legislative Inspectorate, or Judicial Inspectorate is admissible in any constitutional proceeding as authoritative evidence of the factual matters within the publishing Inspectorate’s constitutional mandate. An Inspectorate finding does not bind a court’s legal conclusions — courts independently determine questions of constitutional law — but a court that reaches a legal conclusion inconsistent with an Inspectorate’s published factual finding must address that inconsistency in its written decision. A party may not introduce evidence solely to contradict an Inspectorate finding without first demonstrating to the court a specific, articulable basis for the alleged factual inaccuracy.</w:t>
-      </w:r>
-    </w:p>
     <w:p>
       <w:pPr>
         <w:pBdr>
@@ -5612,6 +5560,58 @@
           <w:szCs w:val="22"/>
         </w:rPr>
         <w:t xml:space="preserve">Courts may not rule on cases that are not ripe for decision — where the alleged injury has not yet materialized into a concrete harm and the claim rests on speculative future events. Courts may not rule on cases that have become moot — where the dispute has been resolved, the injury has ceased, or changed circumstances have eliminated any live controversy between the parties. The prohibition on advisory opinions in §4.3 applies equally to unripe and moot cases. A case does not become moot solely because the challenged government action has ended if: (a) the action is capable of repetition yet evading review — recurring conduct that regularly concludes before courts can rule; or (b) the defendant voluntarily ceased the challenged conduct but the court has no assurance the conduct will not resume. The Supreme Court determines ripeness and mootness standards by published decision; the Legislature may not alter these standards by statute.</w:t>
+      </w:r>
+    </w:p>
+    <w:p>
+      <w:pPr>
+        <w:spacing w:after="60" w:before="60" w:line="280" w:lineRule="auto"/>
+        <w:jc w:val="both"/>
+      </w:pPr>
+      <w:r>
+        <w:rPr>
+          <w:rFonts w:ascii="Times New Roman" w:cs="Times New Roman" w:eastAsia="Times New Roman" w:hAnsi="Times New Roman"/>
+          <w:b/>
+          <w:bCs/>
+          <w:color w:val="1B2A4A"/>
+          <w:sz w:val="22"/>
+          <w:szCs w:val="22"/>
+        </w:rPr>
+        <w:t xml:space="preserve">4.3.d Original Jurisdiction: </w:t>
+      </w:r>
+      <w:r>
+        <w:rPr>
+          <w:rFonts w:ascii="Times New Roman" w:cs="Times New Roman" w:eastAsia="Times New Roman" w:hAnsi="Times New Roman"/>
+          <w:color w:val="000000"/>
+          <w:sz w:val="22"/>
+          <w:szCs w:val="22"/>
+        </w:rPr>
+        <w:t xml:space="preserve">The Supreme Court has original jurisdiction over disputes between States or between a State and the federal government where the dispute presents a constitutional question and no inferior court has jurisdiction adequate to resolve it. Original jurisdiction cases are heard without prior inferior court proceedings. The Supreme Court may establish by published rule the procedures governing original jurisdiction cases; the Legislature may not alter those procedures by statute. Original jurisdiction does not preclude the Court from declining to hear a case that does not present a genuine constitutional question — the standing, ripeness, and mootness requirements of §4.3 apply equally in original jurisdiction cases.</w:t>
+      </w:r>
+    </w:p>
+    <w:p>
+      <w:pPr>
+        <w:spacing w:after="60" w:before="60" w:line="280" w:lineRule="auto"/>
+        <w:jc w:val="both"/>
+      </w:pPr>
+      <w:r>
+        <w:rPr>
+          <w:rFonts w:ascii="Times New Roman" w:cs="Times New Roman" w:eastAsia="Times New Roman" w:hAnsi="Times New Roman"/>
+          <w:b/>
+          <w:bCs/>
+          <w:color w:val="1B2A4A"/>
+          <w:sz w:val="22"/>
+          <w:szCs w:val="22"/>
+        </w:rPr>
+        <w:t xml:space="preserve">4.3.e Inspectorate Findings in Constitutional Proceedings: </w:t>
+      </w:r>
+      <w:r>
+        <w:rPr>
+          <w:rFonts w:ascii="Times New Roman" w:cs="Times New Roman" w:eastAsia="Times New Roman" w:hAnsi="Times New Roman"/>
+          <w:color w:val="000000"/>
+          <w:sz w:val="22"/>
+          <w:szCs w:val="22"/>
+        </w:rPr>
+        <w:t xml:space="preserve">A finding published to the National Record System by the Executive Inspectorate, Legislative Inspectorate, or Judicial Inspectorate is admissible in any constitutional proceeding as authoritative evidence of the factual matters within the publishing Inspectorate’s constitutional mandate. An Inspectorate finding does not bind a court’s legal conclusions — courts independently determine questions of constitutional law — but a court that reaches a legal conclusion inconsistent with an Inspectorate’s published factual finding must address that inconsistency in its written decision. A party may not introduce evidence solely to contradict an Inspectorate finding without first demonstrating to the court a specific, articulable basis for the alleged factual inaccuracy.</w:t>
       </w:r>
     </w:p>
     <w:p>

</xml_diff>